<commit_message>
Update materials for Fall 2026 first week
Syllabus year updated, new PCE doc, updated HTML announcement with placeholders, slides renamed and refreshed
</commit_message>
<xml_diff>
--- a/Dan Levy Course Ops/syllabus/API-209-Syllabus-Fall2026.docx
+++ b/Dan Levy Course Ops/syllabus/API-209-Syllabus-Fall2026.docx
@@ -74,16 +74,7 @@
           <w:sz w:val="22"/>
           <w:szCs w:val="22"/>
         </w:rPr>
-        <w:t>Course Syllabus – Fall 202</w:t>
-      </w:r>
-      <w:r>
-        <w:rPr>
-          <w:rFonts w:ascii="Calibri" w:eastAsia="Calibri" w:hAnsi="Calibri" w:cs="Calibri"/>
-          <w:b/>
-          <w:sz w:val="22"/>
-          <w:szCs w:val="22"/>
-        </w:rPr>
-        <w:t>5</w:t>
+        <w:t>Course Syllabus – Fall 2026</w:t>
       </w:r>
     </w:p>
     <w:p>
@@ -105,16 +96,7 @@
           <w:sz w:val="22"/>
           <w:szCs w:val="22"/>
         </w:rPr>
-        <w:t>First Day of Class</w:t>
-      </w:r>
-      <w:r>
-        <w:rPr>
-          <w:rFonts w:ascii="Calibri" w:eastAsia="Calibri" w:hAnsi="Calibri" w:cs="Calibri"/>
-          <w:b/>
-          <w:sz w:val="22"/>
-          <w:szCs w:val="22"/>
-        </w:rPr>
-        <w:t xml:space="preserve"> version</w:t>
+        <w:t>First Day of Class version</w:t>
       </w:r>
     </w:p>
     <w:p>
@@ -191,13 +173,6 @@
           <w:szCs w:val="22"/>
         </w:rPr>
         <w:t>Faculty:</w:t>
-      </w:r>
-      <w:r>
-        <w:rPr>
-          <w:rFonts w:asciiTheme="majorHAnsi" w:eastAsia="Calibri" w:hAnsiTheme="majorHAnsi" w:cstheme="majorHAnsi"/>
-          <w:sz w:val="22"/>
-          <w:szCs w:val="22"/>
-        </w:rPr>
         <w:tab/>
       </w:r>
       <w:r>
@@ -208,23 +183,7 @@
           <w:szCs w:val="22"/>
         </w:rPr>
         <w:t xml:space="preserve"> </w:t>
-      </w:r>
-      <w:r>
-        <w:rPr>
-          <w:rFonts w:asciiTheme="majorHAnsi" w:eastAsia="Calibri" w:hAnsiTheme="majorHAnsi" w:cstheme="majorHAnsi"/>
-          <w:b/>
-          <w:sz w:val="22"/>
-          <w:szCs w:val="22"/>
-        </w:rPr>
         <w:tab/>
-      </w:r>
-      <w:r>
-        <w:rPr>
-          <w:rFonts w:asciiTheme="majorHAnsi" w:eastAsia="Calibri" w:hAnsiTheme="majorHAnsi" w:cstheme="majorHAnsi"/>
-          <w:b/>
-          <w:sz w:val="22"/>
-          <w:szCs w:val="22"/>
-        </w:rPr>
         <w:tab/>
         <w:t xml:space="preserve">Dan Levy: </w:t>
       </w:r>
@@ -277,33 +236,8 @@
           <w:szCs w:val="22"/>
         </w:rPr>
         <w:t xml:space="preserve"> </w:t>
-      </w:r>
-      <w:r>
-        <w:rPr>
-          <w:rFonts w:asciiTheme="majorHAnsi" w:eastAsia="Calibri" w:hAnsiTheme="majorHAnsi" w:cstheme="majorHAnsi"/>
-          <w:b/>
-          <w:sz w:val="22"/>
-          <w:szCs w:val="22"/>
-        </w:rPr>
         <w:tab/>
-      </w:r>
-      <w:r>
-        <w:rPr>
-          <w:rFonts w:asciiTheme="majorHAnsi" w:eastAsia="Calibri" w:hAnsiTheme="majorHAnsi" w:cstheme="majorHAnsi"/>
-          <w:b/>
-          <w:sz w:val="22"/>
-          <w:szCs w:val="22"/>
-        </w:rPr>
-        <w:t>Bradley Katcher</w:t>
-      </w:r>
-      <w:r>
-        <w:rPr>
-          <w:rFonts w:asciiTheme="majorHAnsi" w:eastAsia="Calibri" w:hAnsiTheme="majorHAnsi" w:cstheme="majorHAnsi"/>
-          <w:b/>
-          <w:sz w:val="22"/>
-          <w:szCs w:val="22"/>
-        </w:rPr>
-        <w:t xml:space="preserve">: </w:t>
+        <w:t xml:space="preserve">Bradley Katcher: </w:t>
       </w:r>
       <w:hyperlink r:id="rId8" w:history="1">
         <w:r>
@@ -355,33 +289,8 @@
           <w:szCs w:val="22"/>
         </w:rPr>
         <w:t xml:space="preserve"> </w:t>
-      </w:r>
-      <w:r>
-        <w:rPr>
-          <w:rFonts w:asciiTheme="majorHAnsi" w:eastAsia="Calibri" w:hAnsiTheme="majorHAnsi" w:cstheme="majorHAnsi"/>
-          <w:b/>
-          <w:sz w:val="22"/>
-          <w:szCs w:val="22"/>
-        </w:rPr>
         <w:tab/>
-      </w:r>
-      <w:r>
-        <w:rPr>
-          <w:rFonts w:asciiTheme="majorHAnsi" w:eastAsia="Calibri" w:hAnsiTheme="majorHAnsi" w:cstheme="majorHAnsi"/>
-          <w:b/>
-          <w:sz w:val="22"/>
-          <w:szCs w:val="22"/>
-        </w:rPr>
-        <w:t>Sonia Cheung</w:t>
-      </w:r>
-      <w:r>
-        <w:rPr>
-          <w:rFonts w:asciiTheme="majorHAnsi" w:eastAsia="Calibri" w:hAnsiTheme="majorHAnsi" w:cstheme="majorHAnsi"/>
-          <w:b/>
-          <w:sz w:val="22"/>
-          <w:szCs w:val="22"/>
-        </w:rPr>
-        <w:t xml:space="preserve">: </w:t>
+        <w:t xml:space="preserve">Sonia Cheung: </w:t>
       </w:r>
       <w:hyperlink r:id="rId9" w:history="1">
         <w:r>
@@ -422,16 +331,7 @@
           <w:sz w:val="22"/>
           <w:szCs w:val="22"/>
         </w:rPr>
-        <w:t>Katharina Meyer</w:t>
-      </w:r>
-      <w:r>
-        <w:rPr>
-          <w:rFonts w:asciiTheme="majorHAnsi" w:eastAsia="Calibri" w:hAnsiTheme="majorHAnsi" w:cstheme="majorHAnsi"/>
-          <w:b/>
-          <w:sz w:val="22"/>
-          <w:szCs w:val="22"/>
-        </w:rPr>
-        <w:t>:</w:t>
+        <w:t>Katharina Meyer:</w:t>
       </w:r>
       <w:r>
         <w:rPr>
@@ -491,16 +391,7 @@
           <w:sz w:val="22"/>
           <w:szCs w:val="22"/>
         </w:rPr>
-        <w:t>Javier Penafiel</w:t>
-      </w:r>
-      <w:r>
-        <w:rPr>
-          <w:rFonts w:asciiTheme="majorHAnsi" w:eastAsia="Calibri" w:hAnsiTheme="majorHAnsi" w:cstheme="majorHAnsi"/>
-          <w:b/>
-          <w:sz w:val="22"/>
-          <w:szCs w:val="22"/>
-        </w:rPr>
-        <w:t>:</w:t>
+        <w:t>Javier Penafiel:</w:t>
       </w:r>
       <w:r>
         <w:rPr>
@@ -558,14 +449,6 @@
           <w:szCs w:val="22"/>
         </w:rPr>
         <w:t xml:space="preserve"> </w:t>
-      </w:r>
-      <w:r>
-        <w:rPr>
-          <w:rFonts w:asciiTheme="majorHAnsi" w:eastAsia="Calibri" w:hAnsiTheme="majorHAnsi" w:cstheme="majorHAnsi"/>
-          <w:b/>
-          <w:sz w:val="22"/>
-          <w:szCs w:val="22"/>
-        </w:rPr>
         <w:tab/>
         <w:t>Victoria Barnum: </w:t>
       </w:r>
@@ -618,41 +501,7 @@
           <w:sz w:val="22"/>
           <w:szCs w:val="22"/>
         </w:rPr>
-        <w:t xml:space="preserve">The goal of this course is to prepare you to analyze public policy issues using statistics. Key topics in the course are in the areas of probability theory, estimation, hypothesis testing, regression analysis, causal inference and </w:t>
-      </w:r>
-      <w:r>
-        <w:rPr>
-          <w:rFonts w:ascii="Calibri" w:eastAsia="Calibri" w:hAnsi="Calibri" w:cs="Calibri"/>
-          <w:sz w:val="22"/>
-          <w:szCs w:val="22"/>
-        </w:rPr>
-        <w:t>machine learning</w:t>
-      </w:r>
-      <w:r>
-        <w:rPr>
-          <w:rFonts w:ascii="Calibri" w:eastAsia="Calibri" w:hAnsi="Calibri" w:cs="Calibri"/>
-          <w:sz w:val="22"/>
-          <w:szCs w:val="22"/>
-        </w:rPr>
-        <w:t xml:space="preserve">. While many students taking this class will have already taken courses in statistical inference and regression analysis, this course will place a much stronger emphasis than typical courses on conceptually understanding the underlying methods. Since the course is targeted to first-year students in the MPA-ID program, we will not shy away from using mathematical tools, but the emphasis of the course will be on the conceptual understanding and application of the tools rather than on the math or the mechanics behind the tools. </w:t>
-      </w:r>
-      <w:proofErr w:type="gramStart"/>
-      <w:r>
-        <w:rPr>
-          <w:rFonts w:ascii="Calibri" w:eastAsia="Calibri" w:hAnsi="Calibri" w:cs="Calibri"/>
-          <w:sz w:val="22"/>
-          <w:szCs w:val="22"/>
-        </w:rPr>
-        <w:t>So</w:t>
-      </w:r>
-      <w:proofErr w:type="gramEnd"/>
-      <w:r>
-        <w:rPr>
-          <w:rFonts w:ascii="Calibri" w:eastAsia="Calibri" w:hAnsi="Calibri" w:cs="Calibri"/>
-          <w:sz w:val="22"/>
-          <w:szCs w:val="22"/>
-        </w:rPr>
-        <w:t xml:space="preserve"> for example, when studying hypothesis testing, we will place a heavier emphasis on what the test is doing, when to use it and how to interpret its results, than on mathematical proofs underpinning the test or on mechanical repetitions of the calculations involved in conducting the test.</w:t>
+        <w:t>The goal of this course is to prepare you to analyze public policy issues using statistics. Key topics in the course are in the areas of probability theory, estimation, hypothesis testing, regression analysis, causal inference and machine learning. While many students taking this class will have already taken courses in statistical inference and regression analysis, this course will place a much stronger emphasis than typical courses on conceptually understanding the underlying methods. Since the course is targeted to first-year students in the MPA-ID program, we will not shy away from using mathematical tools, but the emphasis of the course will be on the conceptual understanding and application of the tools rather than on the math or the mechanics behind the tools. So for example, when studying hypothesis testing, we will place a heavier emphasis on what the test is doing, when to use it and how to interpret its results, than on mathematical proofs underpinning the test or on mechanical repetitions of the calculations involved in conducting the test.</w:t>
       </w:r>
     </w:p>
     <w:p>
@@ -812,127 +661,9 @@
           <w:szCs w:val="22"/>
         </w:rPr>
         <w:t xml:space="preserve">Classes: </w:t>
-      </w:r>
-      <w:r>
-        <w:rPr>
-          <w:rFonts w:ascii="Calibri" w:eastAsia="Calibri" w:hAnsi="Calibri" w:cs="Calibri"/>
-          <w:sz w:val="22"/>
-          <w:szCs w:val="22"/>
-        </w:rPr>
         <w:tab/>
-      </w:r>
-      <w:r>
-        <w:rPr>
-          <w:rFonts w:ascii="Calibri" w:eastAsia="Calibri" w:hAnsi="Calibri" w:cs="Calibri"/>
-          <w:sz w:val="22"/>
-          <w:szCs w:val="22"/>
-        </w:rPr>
         <w:tab/>
-        <w:t xml:space="preserve">Tuesdays and Thursdays, </w:t>
-      </w:r>
-      <w:r>
-        <w:rPr>
-          <w:rFonts w:ascii="Calibri" w:eastAsia="Calibri" w:hAnsi="Calibri" w:cs="Calibri"/>
-          <w:sz w:val="22"/>
-          <w:szCs w:val="22"/>
-        </w:rPr>
-        <w:t>9:0</w:t>
-      </w:r>
-      <w:r>
-        <w:rPr>
-          <w:rFonts w:ascii="Calibri" w:eastAsia="Calibri" w:hAnsi="Calibri" w:cs="Calibri"/>
-          <w:sz w:val="22"/>
-          <w:szCs w:val="22"/>
-        </w:rPr>
-        <w:t xml:space="preserve">0 </w:t>
-      </w:r>
-      <w:r>
-        <w:rPr>
-          <w:rFonts w:ascii="Calibri" w:eastAsia="Calibri" w:hAnsi="Calibri" w:cs="Calibri"/>
-          <w:sz w:val="22"/>
-          <w:szCs w:val="22"/>
-        </w:rPr>
-        <w:t>a</w:t>
-      </w:r>
-      <w:r>
-        <w:rPr>
-          <w:rFonts w:ascii="Calibri" w:eastAsia="Calibri" w:hAnsi="Calibri" w:cs="Calibri"/>
-          <w:sz w:val="22"/>
-          <w:szCs w:val="22"/>
-        </w:rPr>
-        <w:t xml:space="preserve">.m. </w:t>
-      </w:r>
-      <w:r>
-        <w:rPr>
-          <w:rFonts w:ascii="Calibri" w:eastAsia="Calibri" w:hAnsi="Calibri" w:cs="Calibri"/>
-          <w:sz w:val="22"/>
-          <w:szCs w:val="22"/>
-        </w:rPr>
-        <w:t>-</w:t>
-      </w:r>
-      <w:r>
-        <w:rPr>
-          <w:rFonts w:ascii="Calibri" w:eastAsia="Calibri" w:hAnsi="Calibri" w:cs="Calibri"/>
-          <w:sz w:val="22"/>
-          <w:szCs w:val="22"/>
-        </w:rPr>
-        <w:t xml:space="preserve"> </w:t>
-      </w:r>
-      <w:r>
-        <w:rPr>
-          <w:rFonts w:ascii="Calibri" w:eastAsia="Calibri" w:hAnsi="Calibri" w:cs="Calibri"/>
-          <w:sz w:val="22"/>
-          <w:szCs w:val="22"/>
-        </w:rPr>
-        <w:t>10</w:t>
-      </w:r>
-      <w:r>
-        <w:rPr>
-          <w:rFonts w:ascii="Calibri" w:eastAsia="Calibri" w:hAnsi="Calibri" w:cs="Calibri"/>
-          <w:sz w:val="22"/>
-          <w:szCs w:val="22"/>
-        </w:rPr>
-        <w:t>:</w:t>
-      </w:r>
-      <w:r>
-        <w:rPr>
-          <w:rFonts w:ascii="Calibri" w:eastAsia="Calibri" w:hAnsi="Calibri" w:cs="Calibri"/>
-          <w:sz w:val="22"/>
-          <w:szCs w:val="22"/>
-        </w:rPr>
-        <w:t>1</w:t>
-      </w:r>
-      <w:r>
-        <w:rPr>
-          <w:rFonts w:ascii="Calibri" w:eastAsia="Calibri" w:hAnsi="Calibri" w:cs="Calibri"/>
-          <w:sz w:val="22"/>
-          <w:szCs w:val="22"/>
-        </w:rPr>
-        <w:t xml:space="preserve">5 </w:t>
-      </w:r>
-      <w:r>
-        <w:rPr>
-          <w:rFonts w:ascii="Calibri" w:eastAsia="Calibri" w:hAnsi="Calibri" w:cs="Calibri"/>
-          <w:sz w:val="22"/>
-          <w:szCs w:val="22"/>
-        </w:rPr>
-        <w:t>a</w:t>
-      </w:r>
-      <w:r>
-        <w:rPr>
-          <w:rFonts w:ascii="Calibri" w:eastAsia="Calibri" w:hAnsi="Calibri" w:cs="Calibri"/>
-          <w:sz w:val="22"/>
-          <w:szCs w:val="22"/>
-        </w:rPr>
-        <w:t xml:space="preserve">.m. in </w:t>
-      </w:r>
-      <w:r>
-        <w:rPr>
-          <w:rFonts w:ascii="Calibri" w:eastAsia="Calibri" w:hAnsi="Calibri" w:cs="Calibri"/>
-          <w:sz w:val="22"/>
-          <w:szCs w:val="22"/>
-        </w:rPr>
-        <w:t>L140.</w:t>
+        <w:t>Tuesdays and Thursdays, 9:00 a.m. - 10:15 a.m. in L140.</w:t>
       </w:r>
     </w:p>
     <w:p>
@@ -954,111 +685,8 @@
           <w:szCs w:val="22"/>
         </w:rPr>
         <w:t xml:space="preserve">Review sessions: </w:t>
-      </w:r>
-      <w:r>
-        <w:rPr>
-          <w:rFonts w:ascii="Calibri" w:eastAsia="Calibri" w:hAnsi="Calibri" w:cs="Calibri"/>
-          <w:sz w:val="22"/>
-          <w:szCs w:val="22"/>
-        </w:rPr>
         <w:tab/>
-        <w:t xml:space="preserve">Fridays, </w:t>
-      </w:r>
-      <w:r>
-        <w:rPr>
-          <w:rFonts w:ascii="Calibri" w:eastAsia="Calibri" w:hAnsi="Calibri" w:cs="Calibri"/>
-          <w:sz w:val="22"/>
-          <w:szCs w:val="22"/>
-        </w:rPr>
-        <w:t>9:0</w:t>
-      </w:r>
-      <w:r>
-        <w:rPr>
-          <w:rFonts w:ascii="Calibri" w:eastAsia="Calibri" w:hAnsi="Calibri" w:cs="Calibri"/>
-          <w:sz w:val="22"/>
-          <w:szCs w:val="22"/>
-        </w:rPr>
-        <w:t xml:space="preserve">0 </w:t>
-      </w:r>
-      <w:r>
-        <w:rPr>
-          <w:rFonts w:ascii="Calibri" w:eastAsia="Calibri" w:hAnsi="Calibri" w:cs="Calibri"/>
-          <w:sz w:val="22"/>
-          <w:szCs w:val="22"/>
-        </w:rPr>
-        <w:t>a</w:t>
-      </w:r>
-      <w:r>
-        <w:rPr>
-          <w:rFonts w:ascii="Calibri" w:eastAsia="Calibri" w:hAnsi="Calibri" w:cs="Calibri"/>
-          <w:sz w:val="22"/>
-          <w:szCs w:val="22"/>
-        </w:rPr>
-        <w:t xml:space="preserve">.m. - </w:t>
-      </w:r>
-      <w:r>
-        <w:rPr>
-          <w:rFonts w:ascii="Calibri" w:eastAsia="Calibri" w:hAnsi="Calibri" w:cs="Calibri"/>
-          <w:sz w:val="22"/>
-          <w:szCs w:val="22"/>
-        </w:rPr>
-        <w:t>10</w:t>
-      </w:r>
-      <w:r>
-        <w:rPr>
-          <w:rFonts w:ascii="Calibri" w:eastAsia="Calibri" w:hAnsi="Calibri" w:cs="Calibri"/>
-          <w:sz w:val="22"/>
-          <w:szCs w:val="22"/>
-        </w:rPr>
-        <w:t>:</w:t>
-      </w:r>
-      <w:r>
-        <w:rPr>
-          <w:rFonts w:ascii="Calibri" w:eastAsia="Calibri" w:hAnsi="Calibri" w:cs="Calibri"/>
-          <w:sz w:val="22"/>
-          <w:szCs w:val="22"/>
-        </w:rPr>
-        <w:t>1</w:t>
-      </w:r>
-      <w:r>
-        <w:rPr>
-          <w:rFonts w:ascii="Calibri" w:eastAsia="Calibri" w:hAnsi="Calibri" w:cs="Calibri"/>
-          <w:sz w:val="22"/>
-          <w:szCs w:val="22"/>
-        </w:rPr>
-        <w:t xml:space="preserve">5 </w:t>
-      </w:r>
-      <w:r>
-        <w:rPr>
-          <w:rFonts w:ascii="Calibri" w:eastAsia="Calibri" w:hAnsi="Calibri" w:cs="Calibri"/>
-          <w:sz w:val="22"/>
-          <w:szCs w:val="22"/>
-        </w:rPr>
-        <w:t>a</w:t>
-      </w:r>
-      <w:r>
-        <w:rPr>
-          <w:rFonts w:ascii="Calibri" w:eastAsia="Calibri" w:hAnsi="Calibri" w:cs="Calibri"/>
-          <w:sz w:val="22"/>
-          <w:szCs w:val="22"/>
-        </w:rPr>
-        <w:t>.m</w:t>
-      </w:r>
-      <w:r>
-        <w:rPr>
-          <w:rFonts w:ascii="Calibri" w:eastAsia="Calibri" w:hAnsi="Calibri" w:cs="Calibri"/>
-          <w:sz w:val="22"/>
-          <w:szCs w:val="22"/>
-        </w:rPr>
-        <w:t xml:space="preserve">. in </w:t>
-      </w:r>
-      <w:r>
-        <w:rPr>
-          <w:rFonts w:ascii="Calibri" w:eastAsia="Calibri" w:hAnsi="Calibri" w:cs="Calibri"/>
-          <w:sz w:val="22"/>
-          <w:szCs w:val="22"/>
-        </w:rPr>
-        <w:t>L140</w:t>
+        <w:t>Fridays, 9:00 a.m. - 10:15 a.m. in L140</w:t>
       </w:r>
     </w:p>
     <w:p>
@@ -1077,119 +705,7 @@
           <w:sz w:val="22"/>
           <w:szCs w:val="22"/>
         </w:rPr>
-        <w:t xml:space="preserve">and </w:t>
-      </w:r>
-      <w:r>
-        <w:rPr>
-          <w:rFonts w:ascii="Calibri" w:eastAsia="Calibri" w:hAnsi="Calibri" w:cs="Calibri"/>
-          <w:sz w:val="22"/>
-          <w:szCs w:val="22"/>
-        </w:rPr>
-        <w:t>10</w:t>
-      </w:r>
-      <w:r>
-        <w:rPr>
-          <w:rFonts w:ascii="Calibri" w:eastAsia="Calibri" w:hAnsi="Calibri" w:cs="Calibri"/>
-          <w:sz w:val="22"/>
-          <w:szCs w:val="22"/>
-        </w:rPr>
-        <w:t>:</w:t>
-      </w:r>
-      <w:r>
-        <w:rPr>
-          <w:rFonts w:ascii="Calibri" w:eastAsia="Calibri" w:hAnsi="Calibri" w:cs="Calibri"/>
-          <w:sz w:val="22"/>
-          <w:szCs w:val="22"/>
-        </w:rPr>
-        <w:t>30</w:t>
-      </w:r>
-      <w:r>
-        <w:rPr>
-          <w:rFonts w:ascii="Calibri" w:eastAsia="Calibri" w:hAnsi="Calibri" w:cs="Calibri"/>
-          <w:sz w:val="22"/>
-          <w:szCs w:val="22"/>
-        </w:rPr>
-        <w:t xml:space="preserve"> </w:t>
-      </w:r>
-      <w:r>
-        <w:rPr>
-          <w:rFonts w:ascii="Calibri" w:eastAsia="Calibri" w:hAnsi="Calibri" w:cs="Calibri"/>
-          <w:sz w:val="22"/>
-          <w:szCs w:val="22"/>
-        </w:rPr>
-        <w:t>a</w:t>
-      </w:r>
-      <w:r>
-        <w:rPr>
-          <w:rFonts w:ascii="Calibri" w:eastAsia="Calibri" w:hAnsi="Calibri" w:cs="Calibri"/>
-          <w:sz w:val="22"/>
-          <w:szCs w:val="22"/>
-        </w:rPr>
-        <w:t xml:space="preserve">.m. - </w:t>
-      </w:r>
-      <w:r>
-        <w:rPr>
-          <w:rFonts w:ascii="Calibri" w:eastAsia="Calibri" w:hAnsi="Calibri" w:cs="Calibri"/>
-          <w:sz w:val="22"/>
-          <w:szCs w:val="22"/>
-        </w:rPr>
-        <w:t>11</w:t>
-      </w:r>
-      <w:r>
-        <w:rPr>
-          <w:rFonts w:ascii="Calibri" w:eastAsia="Calibri" w:hAnsi="Calibri" w:cs="Calibri"/>
-          <w:sz w:val="22"/>
-          <w:szCs w:val="22"/>
-        </w:rPr>
-        <w:t>:</w:t>
-      </w:r>
-      <w:r>
-        <w:rPr>
-          <w:rFonts w:ascii="Calibri" w:eastAsia="Calibri" w:hAnsi="Calibri" w:cs="Calibri"/>
-          <w:sz w:val="22"/>
-          <w:szCs w:val="22"/>
-        </w:rPr>
-        <w:t>4</w:t>
-      </w:r>
-      <w:r>
-        <w:rPr>
-          <w:rFonts w:ascii="Calibri" w:eastAsia="Calibri" w:hAnsi="Calibri" w:cs="Calibri"/>
-          <w:sz w:val="22"/>
-          <w:szCs w:val="22"/>
-        </w:rPr>
-        <w:t>5</w:t>
-      </w:r>
-      <w:r>
-        <w:rPr>
-          <w:rFonts w:ascii="Calibri" w:eastAsia="Calibri" w:hAnsi="Calibri" w:cs="Calibri"/>
-          <w:sz w:val="22"/>
-          <w:szCs w:val="22"/>
-        </w:rPr>
-        <w:t xml:space="preserve"> a</w:t>
-      </w:r>
-      <w:r>
-        <w:rPr>
-          <w:rFonts w:ascii="Calibri" w:eastAsia="Calibri" w:hAnsi="Calibri" w:cs="Calibri"/>
-          <w:sz w:val="22"/>
-          <w:szCs w:val="22"/>
-        </w:rPr>
-        <w:t xml:space="preserve">.m. </w:t>
-      </w:r>
-      <w:r>
-        <w:rPr>
-          <w:rFonts w:ascii="Calibri" w:eastAsia="Calibri" w:hAnsi="Calibri" w:cs="Calibri"/>
-          <w:sz w:val="22"/>
-          <w:szCs w:val="22"/>
-        </w:rPr>
-        <w:t xml:space="preserve">in </w:t>
-      </w:r>
-      <w:r>
-        <w:rPr>
-          <w:rFonts w:ascii="Calibri" w:eastAsia="Calibri" w:hAnsi="Calibri" w:cs="Calibri"/>
-          <w:sz w:val="22"/>
-          <w:szCs w:val="22"/>
-        </w:rPr>
-        <w:t>L140</w:t>
+        <w:t>and 10:30 a.m. - 11:45 a.m. in L140</w:t>
       </w:r>
     </w:p>
     <w:p>
@@ -1341,23 +857,7 @@
           <w:sz w:val="22"/>
           <w:szCs w:val="22"/>
         </w:rPr>
-        <w:t xml:space="preserve">The main prerequisite for this course is an understanding of calculus at the level of a typical undergraduate calculus course. However, as far as mathematics goes, the most important prerequisite is a certain level of “mathematical sophistication,” </w:t>
-      </w:r>
-      <w:r>
-        <w:rPr>
-          <w:rFonts w:ascii="Calibri" w:eastAsia="Calibri" w:hAnsi="Calibri" w:cs="Calibri"/>
-          <w:sz w:val="22"/>
-          <w:szCs w:val="22"/>
-        </w:rPr>
-        <w:t>i.e.,</w:t>
-      </w:r>
-      <w:r>
-        <w:rPr>
-          <w:rFonts w:ascii="Calibri" w:eastAsia="Calibri" w:hAnsi="Calibri" w:cs="Calibri"/>
-          <w:sz w:val="22"/>
-          <w:szCs w:val="22"/>
-        </w:rPr>
-        <w:t xml:space="preserve"> comfort in dealing with mathematical constructs and arguments.</w:t>
+        <w:t>The main prerequisite for this course is an understanding of calculus at the level of a typical undergraduate calculus course. However, as far as mathematics goes, the most important prerequisite is a certain level of “mathematical sophistication,” i.e., comfort in dealing with mathematical constructs and arguments.</w:t>
       </w:r>
       <w:r>
         <w:rPr>
@@ -1442,47 +942,7 @@
           <w:sz w:val="22"/>
           <w:szCs w:val="22"/>
         </w:rPr>
-        <w:t xml:space="preserve">This course is required for first-year students in the MPA/ID program. Students not in the MPA/ID program will be admitted only with permission of the instructor. Familiarity with the concepts indicated in the background section of the schedule (last column of table below) will be assumed. Students looking for a more mathematical course should consider EC2110 and EC2115 (offered by the Economics Department). Students looking for a less mathematical course should consider API-201 and API-205 (both offered here at HKS). If you have a </w:t>
-      </w:r>
-      <w:r>
-        <w:rPr>
-          <w:rFonts w:ascii="Calibri" w:eastAsia="Calibri" w:hAnsi="Calibri" w:cs="Calibri"/>
-          <w:sz w:val="22"/>
-          <w:szCs w:val="22"/>
-        </w:rPr>
-        <w:t xml:space="preserve">basic </w:t>
-      </w:r>
-      <w:r>
-        <w:rPr>
-          <w:rFonts w:ascii="Calibri" w:eastAsia="Calibri" w:hAnsi="Calibri" w:cs="Calibri"/>
-          <w:sz w:val="22"/>
-          <w:szCs w:val="22"/>
-        </w:rPr>
-        <w:t xml:space="preserve">background in </w:t>
-      </w:r>
-      <w:r>
-        <w:rPr>
-          <w:rFonts w:ascii="Calibri" w:eastAsia="Calibri" w:hAnsi="Calibri" w:cs="Calibri"/>
-          <w:sz w:val="22"/>
-          <w:szCs w:val="22"/>
-        </w:rPr>
-        <w:t>probability</w:t>
-      </w:r>
-      <w:r>
-        <w:rPr>
-          <w:rFonts w:ascii="Calibri" w:eastAsia="Calibri" w:hAnsi="Calibri" w:cs="Calibri"/>
-          <w:sz w:val="22"/>
-          <w:szCs w:val="22"/>
-        </w:rPr>
-        <w:t xml:space="preserve"> and economics and are looking for a course that broadens your analytical toolkit, you might consider taking</w:t>
-      </w:r>
-      <w:r>
-        <w:rPr>
-          <w:rFonts w:ascii="Calibri" w:eastAsia="Calibri" w:hAnsi="Calibri" w:cs="Calibri"/>
-          <w:sz w:val="22"/>
-          <w:szCs w:val="22"/>
-        </w:rPr>
-        <w:t xml:space="preserve"> </w:t>
+        <w:t xml:space="preserve">This course is required for first-year students in the MPA/ID program. Students not in the MPA/ID program will be admitted only with permission of the instructor. Familiarity with the concepts indicated in the background section of the schedule (last column of table below) will be assumed. Students looking for a more mathematical course should consider EC2110 and EC2115 (offered by the Economics Department). Students looking for a less mathematical course should consider API-201 and API-205 (both offered here at HKS). If you have a basic background in probability and economics and are looking for a course that broadens your analytical toolkit, you might consider taking </w:t>
       </w:r>
       <w:hyperlink r:id="rId15" w:history="1">
         <w:r>
@@ -1501,15 +961,7 @@
           <w:sz w:val="22"/>
           <w:szCs w:val="22"/>
         </w:rPr>
-        <w:t>, an elective I am also teaching this Fall</w:t>
-      </w:r>
-      <w:r>
-        <w:rPr>
-          <w:rFonts w:ascii="Calibri" w:eastAsia="Calibri" w:hAnsi="Calibri" w:cs="Calibri"/>
-          <w:sz w:val="22"/>
-          <w:szCs w:val="22"/>
-        </w:rPr>
-        <w:t xml:space="preserve">, or </w:t>
+        <w:t xml:space="preserve">, an elective I am also teaching this Fall, or </w:t>
       </w:r>
       <w:hyperlink r:id="rId16" w:history="1">
         <w:r>
@@ -1658,57 +1110,7 @@
           <w:sz w:val="22"/>
           <w:szCs w:val="22"/>
         </w:rPr>
-        <w:t xml:space="preserve">, by Jeffrey Wooldridge, South-Western, </w:t>
-      </w:r>
-      <w:r>
-        <w:rPr>
-          <w:rFonts w:ascii="Calibri" w:eastAsia="Calibri" w:hAnsi="Calibri" w:cs="Calibri"/>
-          <w:sz w:val="22"/>
-          <w:szCs w:val="22"/>
-        </w:rPr>
-        <w:t>Seventh Edition</w:t>
-      </w:r>
-      <w:r>
-        <w:rPr>
-          <w:rFonts w:ascii="Calibri" w:eastAsia="Calibri" w:hAnsi="Calibri" w:cs="Calibri"/>
-          <w:sz w:val="22"/>
-          <w:szCs w:val="22"/>
-        </w:rPr>
-        <w:t>, 20</w:t>
-      </w:r>
-      <w:r>
-        <w:rPr>
-          <w:rFonts w:ascii="Calibri" w:eastAsia="Calibri" w:hAnsi="Calibri" w:cs="Calibri"/>
-          <w:sz w:val="22"/>
-          <w:szCs w:val="22"/>
-        </w:rPr>
-        <w:t>18</w:t>
-      </w:r>
-      <w:r>
-        <w:rPr>
-          <w:rFonts w:ascii="Calibri" w:eastAsia="Calibri" w:hAnsi="Calibri" w:cs="Calibri"/>
-          <w:sz w:val="22"/>
-          <w:szCs w:val="22"/>
-        </w:rPr>
-        <w:t xml:space="preserve">. [W]. This textbook will be used mainly for regression </w:t>
-      </w:r>
-      <w:proofErr w:type="gramStart"/>
-      <w:r>
-        <w:rPr>
-          <w:rFonts w:ascii="Calibri" w:eastAsia="Calibri" w:hAnsi="Calibri" w:cs="Calibri"/>
-          <w:sz w:val="22"/>
-          <w:szCs w:val="22"/>
-        </w:rPr>
-        <w:t>analysis, and</w:t>
-      </w:r>
-      <w:proofErr w:type="gramEnd"/>
-      <w:r>
-        <w:rPr>
-          <w:rFonts w:ascii="Calibri" w:eastAsia="Calibri" w:hAnsi="Calibri" w:cs="Calibri"/>
-          <w:sz w:val="22"/>
-          <w:szCs w:val="22"/>
-        </w:rPr>
-        <w:t xml:space="preserve"> may be a useful book for API-210. This book is available for purchase at the Harvard Coop and other bookstores.</w:t>
+        <w:t>, by Jeffrey Wooldridge, South-Western, Seventh Edition, 2018. [W]. This textbook will be used mainly for regression analysis, and may be a useful book for API-210. This book is available for purchase at the Harvard Coop and other bookstores.</w:t>
       </w:r>
     </w:p>
     <w:p>
@@ -1808,43 +1210,7 @@
           <w:sz w:val="22"/>
           <w:szCs w:val="22"/>
         </w:rPr>
-        <w:t xml:space="preserve">, by DeGroot and </w:t>
-      </w:r>
-      <w:proofErr w:type="spellStart"/>
-      <w:r>
-        <w:rPr>
-          <w:rFonts w:ascii="Calibri" w:eastAsia="Calibri" w:hAnsi="Calibri" w:cs="Calibri"/>
-          <w:sz w:val="22"/>
-          <w:szCs w:val="22"/>
-        </w:rPr>
-        <w:t>Schervish</w:t>
-      </w:r>
-      <w:proofErr w:type="spellEnd"/>
-      <w:r>
-        <w:rPr>
-          <w:rFonts w:ascii="Calibri" w:eastAsia="Calibri" w:hAnsi="Calibri" w:cs="Calibri"/>
-          <w:sz w:val="22"/>
-          <w:szCs w:val="22"/>
-        </w:rPr>
-        <w:t xml:space="preserve">, Addison Wesley: This textbook is similar to WMS both in style and mathematical </w:t>
-      </w:r>
-      <w:proofErr w:type="gramStart"/>
-      <w:r>
-        <w:rPr>
-          <w:rFonts w:ascii="Calibri" w:eastAsia="Calibri" w:hAnsi="Calibri" w:cs="Calibri"/>
-          <w:sz w:val="22"/>
-          <w:szCs w:val="22"/>
-        </w:rPr>
-        <w:t>sophistication, but</w:t>
-      </w:r>
-      <w:proofErr w:type="gramEnd"/>
-      <w:r>
-        <w:rPr>
-          <w:rFonts w:ascii="Calibri" w:eastAsia="Calibri" w:hAnsi="Calibri" w:cs="Calibri"/>
-          <w:sz w:val="22"/>
-          <w:szCs w:val="22"/>
-        </w:rPr>
-        <w:t xml:space="preserve"> is organized slightly differently.</w:t>
+        <w:t>, by DeGroot and Schervish, Addison Wesley: This textbook is similar to WMS both in style and mathematical sophistication, but is organized slightly differently.</w:t>
       </w:r>
     </w:p>
     <w:p>
@@ -1870,63 +1236,7 @@
           <w:sz w:val="22"/>
           <w:szCs w:val="22"/>
         </w:rPr>
-        <w:t xml:space="preserve">Mind on Statistics, by </w:t>
-      </w:r>
-      <w:proofErr w:type="spellStart"/>
-      <w:r>
-        <w:rPr>
-          <w:rFonts w:ascii="Calibri" w:eastAsia="Calibri" w:hAnsi="Calibri" w:cs="Calibri"/>
-          <w:i/>
-          <w:sz w:val="22"/>
-          <w:szCs w:val="22"/>
-        </w:rPr>
-        <w:t>Utts</w:t>
-      </w:r>
-      <w:proofErr w:type="spellEnd"/>
-      <w:r>
-        <w:rPr>
-          <w:rFonts w:ascii="Calibri" w:eastAsia="Calibri" w:hAnsi="Calibri" w:cs="Calibri"/>
-          <w:i/>
-          <w:sz w:val="22"/>
-          <w:szCs w:val="22"/>
-        </w:rPr>
-        <w:t xml:space="preserve"> and Heckard, </w:t>
-      </w:r>
-      <w:r>
-        <w:rPr>
-          <w:rFonts w:ascii="Calibri" w:eastAsia="Calibri" w:hAnsi="Calibri" w:cs="Calibri"/>
-          <w:i/>
-          <w:sz w:val="22"/>
-          <w:szCs w:val="22"/>
-        </w:rPr>
-        <w:t>Sixt</w:t>
-      </w:r>
-      <w:r>
-        <w:rPr>
-          <w:rFonts w:ascii="Calibri" w:eastAsia="Calibri" w:hAnsi="Calibri" w:cs="Calibri"/>
-          <w:i/>
-          <w:sz w:val="22"/>
-          <w:szCs w:val="22"/>
-        </w:rPr>
-        <w:t>h Edition, 20</w:t>
-      </w:r>
-      <w:r>
-        <w:rPr>
-          <w:rFonts w:ascii="Calibri" w:eastAsia="Calibri" w:hAnsi="Calibri" w:cs="Calibri"/>
-          <w:i/>
-          <w:sz w:val="22"/>
-          <w:szCs w:val="22"/>
-        </w:rPr>
-        <w:t>21</w:t>
-      </w:r>
-      <w:r>
-        <w:rPr>
-          <w:rFonts w:ascii="Calibri" w:eastAsia="Calibri" w:hAnsi="Calibri" w:cs="Calibri"/>
-          <w:i/>
-          <w:sz w:val="22"/>
-          <w:szCs w:val="22"/>
-        </w:rPr>
-        <w:t>, Cengage.</w:t>
+        <w:t>Mind on Statistics, by Utts and Heckard, Sixth Edition, 2021, Cengage.</w:t>
       </w:r>
       <w:r>
         <w:rPr>
@@ -2157,15 +1467,7 @@
           <w:sz w:val="22"/>
           <w:szCs w:val="22"/>
         </w:rPr>
-        <w:t xml:space="preserve">. </w:t>
-      </w:r>
-      <w:r>
-        <w:rPr>
-          <w:rFonts w:asciiTheme="majorHAnsi" w:hAnsiTheme="majorHAnsi" w:cstheme="majorHAnsi"/>
-          <w:sz w:val="22"/>
-          <w:szCs w:val="22"/>
-        </w:rPr>
-        <w:t xml:space="preserve"> </w:t>
+        <w:t xml:space="preserve">.  </w:t>
       </w:r>
     </w:p>
     <w:p>
@@ -2301,21 +1603,7 @@
           <w:szCs w:val="22"/>
         </w:rPr>
         <w:tab/>
-      </w:r>
-      <w:r>
-        <w:rPr>
-          <w:rFonts w:ascii="Calibri" w:eastAsia="Calibri" w:hAnsi="Calibri" w:cs="Calibri"/>
-          <w:sz w:val="22"/>
-          <w:szCs w:val="22"/>
-        </w:rPr>
         <w:tab/>
-      </w:r>
-      <w:r>
-        <w:rPr>
-          <w:rFonts w:ascii="Calibri" w:eastAsia="Calibri" w:hAnsi="Calibri" w:cs="Calibri"/>
-          <w:sz w:val="22"/>
-          <w:szCs w:val="22"/>
-        </w:rPr>
         <w:t xml:space="preserve"> 5% - Pre-Class Exercises (PCEs)</w:t>
       </w:r>
     </w:p>
@@ -2374,13 +1662,6 @@
           <w:szCs w:val="22"/>
         </w:rPr>
         <w:tab/>
-      </w:r>
-      <w:r>
-        <w:rPr>
-          <w:rFonts w:ascii="Calibri" w:eastAsia="Calibri" w:hAnsi="Calibri" w:cs="Calibri"/>
-          <w:sz w:val="22"/>
-          <w:szCs w:val="22"/>
-        </w:rPr>
         <w:tab/>
         <w:t>15% - Class participation and engagement</w:t>
       </w:r>
@@ -2402,13 +1683,6 @@
           <w:szCs w:val="22"/>
         </w:rPr>
         <w:tab/>
-      </w:r>
-      <w:r>
-        <w:rPr>
-          <w:rFonts w:ascii="Calibri" w:eastAsia="Calibri" w:hAnsi="Calibri" w:cs="Calibri"/>
-          <w:sz w:val="22"/>
-          <w:szCs w:val="22"/>
-        </w:rPr>
         <w:tab/>
         <w:t>25% - Midterm exam</w:t>
       </w:r>
@@ -2430,13 +1704,6 @@
           <w:szCs w:val="22"/>
         </w:rPr>
         <w:tab/>
-      </w:r>
-      <w:r>
-        <w:rPr>
-          <w:rFonts w:ascii="Calibri" w:eastAsia="Calibri" w:hAnsi="Calibri" w:cs="Calibri"/>
-          <w:sz w:val="22"/>
-          <w:szCs w:val="22"/>
-        </w:rPr>
         <w:tab/>
         <w:t>35% - Final exam</w:t>
       </w:r>
@@ -2489,15 +1756,16 @@
           <w:sz w:val="22"/>
           <w:szCs w:val="22"/>
         </w:rPr>
-        <w:t>Preparing for class is essential for your learning and that of your classmates</w:t>
+        <w:t xml:space="preserve">Preparing for class is essential for your learning and that of your classmates. The preparation will often involve engaging with an online module about topics for an upcoming class, some quick questions about the previous class or responding to a short survey. I will aim to make these pre-class exercises take an average of 30 minutes or less. My pledge to you is that the bulk of the pre-class work I ask you to do will feed directly into the work we do during class, so you and everyone else in the classroom will get more out of the class if you have prepared properly. Pre-class Exercises (PCEs) are due at </w:t>
       </w:r>
       <w:r>
         <w:rPr>
           <w:rFonts w:asciiTheme="majorHAnsi" w:hAnsiTheme="majorHAnsi" w:cstheme="majorHAnsi"/>
           <w:sz w:val="22"/>
           <w:szCs w:val="22"/>
-        </w:rPr>
-        <w:t xml:space="preserve">. </w:t>
+          <w:u w:val="single"/>
+        </w:rPr>
+        <w:t>7:00 AM</w:t>
       </w:r>
       <w:r>
         <w:rPr>
@@ -2505,122 +1773,7 @@
           <w:sz w:val="22"/>
           <w:szCs w:val="22"/>
         </w:rPr>
-        <w:t xml:space="preserve">The preparation will often involve </w:t>
-      </w:r>
-      <w:r>
-        <w:rPr>
-          <w:rFonts w:asciiTheme="majorHAnsi" w:hAnsiTheme="majorHAnsi" w:cstheme="majorHAnsi"/>
-          <w:sz w:val="22"/>
-          <w:szCs w:val="22"/>
-        </w:rPr>
-        <w:t>engaging with an online module about topics for an upcoming class</w:t>
-      </w:r>
-      <w:r>
-        <w:rPr>
-          <w:rFonts w:asciiTheme="majorHAnsi" w:hAnsiTheme="majorHAnsi" w:cstheme="majorHAnsi"/>
-          <w:sz w:val="22"/>
-          <w:szCs w:val="22"/>
-        </w:rPr>
-        <w:t xml:space="preserve">, </w:t>
-      </w:r>
-      <w:r>
-        <w:rPr>
-          <w:rFonts w:asciiTheme="majorHAnsi" w:hAnsiTheme="majorHAnsi" w:cstheme="majorHAnsi"/>
-          <w:sz w:val="22"/>
-          <w:szCs w:val="22"/>
-        </w:rPr>
-        <w:t>some quick questions about the previous class or responding to a short survey</w:t>
-      </w:r>
-      <w:r>
-        <w:rPr>
-          <w:rFonts w:asciiTheme="majorHAnsi" w:hAnsiTheme="majorHAnsi" w:cstheme="majorHAnsi"/>
-          <w:sz w:val="22"/>
-          <w:szCs w:val="22"/>
-        </w:rPr>
-        <w:t xml:space="preserve">. </w:t>
-      </w:r>
-      <w:r>
-        <w:rPr>
-          <w:rFonts w:asciiTheme="majorHAnsi" w:hAnsiTheme="majorHAnsi" w:cstheme="majorHAnsi"/>
-          <w:sz w:val="22"/>
-          <w:szCs w:val="22"/>
-        </w:rPr>
-        <w:t>I will aim to make these pre-class exercises take an average of 30 minutes or less</w:t>
-      </w:r>
-      <w:r>
-        <w:rPr>
-          <w:rFonts w:asciiTheme="majorHAnsi" w:hAnsiTheme="majorHAnsi" w:cstheme="majorHAnsi"/>
-          <w:sz w:val="22"/>
-          <w:szCs w:val="22"/>
-        </w:rPr>
-        <w:t xml:space="preserve">. My pledge to you is that the </w:t>
-      </w:r>
-      <w:r>
-        <w:rPr>
-          <w:rFonts w:asciiTheme="majorHAnsi" w:hAnsiTheme="majorHAnsi" w:cstheme="majorHAnsi"/>
-          <w:sz w:val="22"/>
-          <w:szCs w:val="22"/>
-        </w:rPr>
-        <w:t xml:space="preserve">bulk of the </w:t>
-      </w:r>
-      <w:r>
-        <w:rPr>
-          <w:rFonts w:asciiTheme="majorHAnsi" w:hAnsiTheme="majorHAnsi" w:cstheme="majorHAnsi"/>
-          <w:sz w:val="22"/>
-          <w:szCs w:val="22"/>
-        </w:rPr>
-        <w:t xml:space="preserve">pre-class work I ask you to do will feed directly into the work we do during class, so you and everyone else in the classroom will get more out of the class if you have prepared properly. Pre-class Exercises (PCEs) are due at </w:t>
-      </w:r>
-      <w:r>
-        <w:rPr>
-          <w:rFonts w:asciiTheme="majorHAnsi" w:hAnsiTheme="majorHAnsi" w:cstheme="majorHAnsi"/>
-          <w:sz w:val="22"/>
-          <w:szCs w:val="22"/>
-          <w:u w:val="single"/>
-        </w:rPr>
-        <w:t>7:00</w:t>
-      </w:r>
-      <w:r>
-        <w:rPr>
-          <w:rFonts w:asciiTheme="majorHAnsi" w:hAnsiTheme="majorHAnsi" w:cstheme="majorHAnsi"/>
-          <w:sz w:val="22"/>
-          <w:szCs w:val="22"/>
-          <w:u w:val="single"/>
-        </w:rPr>
-        <w:t xml:space="preserve"> </w:t>
-      </w:r>
-      <w:r>
-        <w:rPr>
-          <w:rFonts w:asciiTheme="majorHAnsi" w:hAnsiTheme="majorHAnsi" w:cstheme="majorHAnsi"/>
-          <w:sz w:val="22"/>
-          <w:szCs w:val="22"/>
-          <w:u w:val="single"/>
-        </w:rPr>
-        <w:t>AM</w:t>
-      </w:r>
-      <w:r>
-        <w:rPr>
-          <w:rFonts w:asciiTheme="majorHAnsi" w:hAnsiTheme="majorHAnsi" w:cstheme="majorHAnsi"/>
-          <w:sz w:val="22"/>
-          <w:szCs w:val="22"/>
-        </w:rPr>
-        <w:t xml:space="preserve"> on the days classes are held (to allow for enough time for me to read your work and use it to adapt the class plan to where you are). For </w:t>
-      </w:r>
-      <w:r>
-        <w:rPr>
-          <w:rFonts w:asciiTheme="majorHAnsi" w:hAnsiTheme="majorHAnsi" w:cstheme="majorHAnsi"/>
-          <w:sz w:val="22"/>
-          <w:szCs w:val="22"/>
-        </w:rPr>
-        <w:t>this component of the grade</w:t>
-      </w:r>
-      <w:r>
-        <w:rPr>
-          <w:rFonts w:asciiTheme="majorHAnsi" w:hAnsiTheme="majorHAnsi" w:cstheme="majorHAnsi"/>
-          <w:sz w:val="22"/>
-          <w:szCs w:val="22"/>
-        </w:rPr>
-        <w:t>, you will be evaluated on completion, thoughtfulness and effort.</w:t>
+        <w:t xml:space="preserve"> on the days classes are held (to allow for enough time for me to read your work and use it to adapt the class plan to where you are). For this component of the grade, you will be evaluated on completion, thoughtfulness and effort.</w:t>
       </w:r>
     </w:p>
     <w:p>
@@ -2825,52 +1978,9 @@
           <w:sz w:val="22"/>
           <w:szCs w:val="22"/>
         </w:rPr>
-        <w:t xml:space="preserve"> (available here) for all aspects of the course. In terms of problem sets, unless explicitly written otherwise, the norms are the following: You are free (and encouraged) to discuss problem sets with your classmates. However, you must hand in your own unique written work and code in all cases. Any copy/paste of another’s work is plagiarism. In other words, you can work with your classmate(s), sitting side-by-side and going through the problem set question-by-question, but you must each type your own answers and your own code. Your answers may be </w:t>
-      </w:r>
-      <w:proofErr w:type="gramStart"/>
-      <w:r>
-        <w:rPr>
-          <w:rFonts w:ascii="Calibri" w:eastAsia="Calibri" w:hAnsi="Calibri" w:cs="Calibri"/>
-          <w:sz w:val="22"/>
-          <w:szCs w:val="22"/>
-        </w:rPr>
-        <w:t>similar</w:t>
-      </w:r>
-      <w:proofErr w:type="gramEnd"/>
-      <w:r>
-        <w:rPr>
-          <w:rFonts w:ascii="Calibri" w:eastAsia="Calibri" w:hAnsi="Calibri" w:cs="Calibri"/>
-          <w:sz w:val="22"/>
-          <w:szCs w:val="22"/>
-        </w:rPr>
-        <w:t xml:space="preserve"> but </w:t>
-      </w:r>
-      <w:r>
-        <w:rPr>
-          <w:rFonts w:ascii="Calibri" w:eastAsia="Calibri" w:hAnsi="Calibri" w:cs="Calibri"/>
-          <w:sz w:val="22"/>
-          <w:szCs w:val="22"/>
-        </w:rPr>
+        <w:t xml:space="preserve"> (available here) for all aspects of the course. In terms of problem sets, unless explicitly written otherwise, the norms are the following: You are free (and encouraged) to discuss problem sets with your classmates. However, you must hand in your own unique written work and code in all cases. Any copy/paste of another’s work is plagiarism. In other words, you can work with your classmate(s), sitting side-by-side and going through the problem set question-by-question, but you must each type your own answers and your own code. Your answers may be similar but </w:t>
         <w:lastRenderedPageBreak/>
-        <w:t xml:space="preserve">they must not be identical, or even </w:t>
-      </w:r>
-      <w:proofErr w:type="spellStart"/>
-      <w:r>
-        <w:rPr>
-          <w:rFonts w:ascii="Calibri" w:eastAsia="Calibri" w:hAnsi="Calibri" w:cs="Calibri"/>
-          <w:sz w:val="22"/>
-          <w:szCs w:val="22"/>
-        </w:rPr>
-        <w:t>identical’ish</w:t>
-      </w:r>
-      <w:proofErr w:type="spellEnd"/>
-      <w:r>
-        <w:rPr>
-          <w:rFonts w:ascii="Calibri" w:eastAsia="Calibri" w:hAnsi="Calibri" w:cs="Calibri"/>
-          <w:sz w:val="22"/>
-          <w:szCs w:val="22"/>
-        </w:rPr>
-        <w:t>. Violations of the Academic Code are a serious violation of academic and professional standards and can lead to a failing grade in the course, failure to graduate, and even expulsion from the University. I take this issue very seriously. If you have questions about the degree of collaboration allowed or about any other aspect of the Academic Code, please come to see me.</w:t>
+        <w:t>they must not be identical, or even identical’ish. Violations of the Academic Code are a serious violation of academic and professional standards and can lead to a failing grade in the course, failure to graduate, and even expulsion from the University. I take this issue very seriously. If you have questions about the degree of collaboration allowed or about any other aspect of the Academic Code, please come to see me.</w:t>
       </w:r>
     </w:p>
     <w:p>
@@ -2979,43 +2089,7 @@
           <w:szCs w:val="22"/>
           <w:u w:val="single"/>
         </w:rPr>
-        <w:t>7</w:t>
-      </w:r>
-      <w:r>
-        <w:rPr>
-          <w:rFonts w:ascii="Calibri" w:eastAsia="Calibri" w:hAnsi="Calibri" w:cs="Calibri"/>
-          <w:sz w:val="22"/>
-          <w:szCs w:val="22"/>
-          <w:u w:val="single"/>
-        </w:rPr>
-        <w:t>:</w:t>
-      </w:r>
-      <w:r>
-        <w:rPr>
-          <w:rFonts w:ascii="Calibri" w:eastAsia="Calibri" w:hAnsi="Calibri" w:cs="Calibri"/>
-          <w:sz w:val="22"/>
-          <w:szCs w:val="22"/>
-          <w:u w:val="single"/>
-        </w:rPr>
-        <w:t>0</w:t>
-      </w:r>
-      <w:r>
-        <w:rPr>
-          <w:rFonts w:ascii="Calibri" w:eastAsia="Calibri" w:hAnsi="Calibri" w:cs="Calibri"/>
-          <w:sz w:val="22"/>
-          <w:szCs w:val="22"/>
-          <w:u w:val="single"/>
-        </w:rPr>
-        <w:t xml:space="preserve">0 </w:t>
-      </w:r>
-      <w:r>
-        <w:rPr>
-          <w:rFonts w:ascii="Calibri" w:eastAsia="Calibri" w:hAnsi="Calibri" w:cs="Calibri"/>
-          <w:sz w:val="22"/>
-          <w:szCs w:val="22"/>
-          <w:u w:val="single"/>
-        </w:rPr>
-        <w:t>AM</w:t>
+        <w:t>7:00 AM</w:t>
       </w:r>
       <w:r>
         <w:rPr>
@@ -3141,27 +2215,7 @@
           <w:sz w:val="22"/>
           <w:szCs w:val="22"/>
         </w:rPr>
-        <w:t xml:space="preserve">: I strongly believe that student participation can substantially enrich the learning experience for both the students and the instructor. In this spirit, you are encouraged to ask questions and to share with the class any relevant insights you may have from your work experience or from previous exposure to the topic at hand. Effective class participation requires that you come prepared for class, and that you think about how your comment or question may enrich the learning experience of your classmates. I also ask that the questions and comments be brief and related to the topic being discussed. I will sometimes need to defer questions for a future class or office hours. A strong engagement in class also means attending class regularly and punctually, engaging actively in both </w:t>
-      </w:r>
-      <w:proofErr w:type="spellStart"/>
-      <w:r>
-        <w:rPr>
-          <w:rFonts w:ascii="Calibri" w:eastAsia="Calibri" w:hAnsi="Calibri" w:cs="Calibri"/>
-          <w:color w:val="000000"/>
-          <w:sz w:val="22"/>
-          <w:szCs w:val="22"/>
-        </w:rPr>
-        <w:t>classwide</w:t>
-      </w:r>
-      <w:proofErr w:type="spellEnd"/>
-      <w:r>
-        <w:rPr>
-          <w:rFonts w:ascii="Calibri" w:eastAsia="Calibri" w:hAnsi="Calibri" w:cs="Calibri"/>
-          <w:color w:val="000000"/>
-          <w:sz w:val="22"/>
-          <w:szCs w:val="22"/>
-        </w:rPr>
-        <w:t xml:space="preserve"> and small group activities, and in general contributing to a positive learning atmosphere in the classroom.</w:t>
+        <w:t>: I strongly believe that student participation can substantially enrich the learning experience for both the students and the instructor. In this spirit, you are encouraged to ask questions and to share with the class any relevant insights you may have from your work experience or from previous exposure to the topic at hand. Effective class participation requires that you come prepared for class, and that you think about how your comment or question may enrich the learning experience of your classmates. I also ask that the questions and comments be brief and related to the topic being discussed. I will sometimes need to defer questions for a future class or office hours. A strong engagement in class also means attending class regularly and punctually, engaging actively in both classwide and small group activities, and in general contributing to a positive learning atmosphere in the classroom.</w:t>
       </w:r>
     </w:p>
     <w:p>
@@ -3247,16 +2301,7 @@
           <w:sz w:val="22"/>
           <w:szCs w:val="22"/>
         </w:rPr>
-        <w:t>Y</w:t>
-      </w:r>
-      <w:r>
-        <w:rPr>
-          <w:rFonts w:ascii="Calibri" w:eastAsia="Calibri" w:hAnsi="Calibri" w:cs="Calibri"/>
-          <w:color w:val="000000"/>
-          <w:sz w:val="22"/>
-          <w:szCs w:val="22"/>
-        </w:rPr>
-        <w:t xml:space="preserve">ou are expected to attend and engage in all classes. If you must miss a class, please let us know </w:t>
+        <w:t xml:space="preserve">You are expected to attend and engage in all classes. If you must miss a class, please let us know </w:t>
       </w:r>
       <w:bookmarkEnd w:id="15"/>
       <w:r>
@@ -3277,36 +2322,7 @@
           <w:sz w:val="22"/>
           <w:szCs w:val="22"/>
         </w:rPr>
-        <w:t xml:space="preserve"> (except in cases of medical emergencies) through </w:t>
-      </w:r>
-      <w:proofErr w:type="spellStart"/>
-      <w:r>
-        <w:rPr>
-          <w:rFonts w:ascii="Calibri" w:eastAsia="Calibri" w:hAnsi="Calibri" w:cs="Calibri"/>
-          <w:color w:val="000000"/>
-          <w:sz w:val="22"/>
-          <w:szCs w:val="22"/>
-        </w:rPr>
-        <w:t>Teachly</w:t>
-      </w:r>
-      <w:proofErr w:type="spellEnd"/>
-      <w:r>
-        <w:rPr>
-          <w:rFonts w:ascii="Calibri" w:eastAsia="Calibri" w:hAnsi="Calibri" w:cs="Calibri"/>
-          <w:color w:val="000000"/>
-          <w:sz w:val="22"/>
-          <w:szCs w:val="22"/>
-        </w:rPr>
-        <w:t xml:space="preserve"> </w:t>
-      </w:r>
-      <w:r>
-        <w:rPr>
-          <w:rFonts w:ascii="Calibri" w:eastAsia="Calibri" w:hAnsi="Calibri" w:cs="Calibri"/>
-          <w:color w:val="000000"/>
-          <w:sz w:val="22"/>
-          <w:szCs w:val="22"/>
-        </w:rPr>
-        <w:t xml:space="preserve">(details </w:t>
+        <w:t xml:space="preserve"> (except in cases of medical emergencies) through Teachly (details </w:t>
       </w:r>
       <w:hyperlink r:id="rId22" w:history="1">
         <w:r>
@@ -3326,43 +2342,7 @@
           <w:sz w:val="22"/>
           <w:szCs w:val="22"/>
         </w:rPr>
-        <w:t xml:space="preserve">) </w:t>
-      </w:r>
-      <w:r>
-        <w:rPr>
-          <w:rFonts w:ascii="Calibri" w:eastAsia="Calibri" w:hAnsi="Calibri" w:cs="Calibri"/>
-          <w:color w:val="000000"/>
-          <w:sz w:val="22"/>
-          <w:szCs w:val="22"/>
-        </w:rPr>
-        <w:t xml:space="preserve">and watch the </w:t>
-      </w:r>
-      <w:r>
-        <w:rPr>
-          <w:rFonts w:ascii="Calibri" w:eastAsia="Calibri" w:hAnsi="Calibri" w:cs="Calibri"/>
-          <w:color w:val="000000"/>
-          <w:sz w:val="22"/>
-          <w:szCs w:val="22"/>
-        </w:rPr>
-        <w:t xml:space="preserve">class video </w:t>
-      </w:r>
-      <w:r>
-        <w:rPr>
-          <w:rFonts w:ascii="Calibri" w:eastAsia="Calibri" w:hAnsi="Calibri" w:cs="Calibri"/>
-          <w:color w:val="000000"/>
-          <w:sz w:val="22"/>
-          <w:szCs w:val="22"/>
-        </w:rPr>
-        <w:t>recording. To help us keep accurate records, use the form rather than email to report absences.</w:t>
-      </w:r>
-      <w:r>
-        <w:rPr>
-          <w:rFonts w:ascii="Calibri" w:eastAsia="Calibri" w:hAnsi="Calibri" w:cs="Calibri"/>
-          <w:color w:val="000000"/>
-          <w:sz w:val="22"/>
-          <w:szCs w:val="22"/>
-        </w:rPr>
-        <w:t xml:space="preserve"> </w:t>
+        <w:t xml:space="preserve">) and watch the class video recording. To help us keep accurate records, use the form rather than email to report absences. </w:t>
       </w:r>
     </w:p>
     <w:bookmarkEnd w:id="16"/>
@@ -3395,25 +2375,7 @@
           <w:szCs w:val="22"/>
           <w:u w:val="single"/>
         </w:rPr>
-        <w:t>Final Exercise (1</w:t>
-      </w:r>
-      <w:r>
-        <w:rPr>
-          <w:rFonts w:ascii="Calibri" w:eastAsia="Calibri" w:hAnsi="Calibri" w:cs="Calibri"/>
-          <w:sz w:val="22"/>
-          <w:szCs w:val="22"/>
-          <w:u w:val="single"/>
-        </w:rPr>
-        <w:t>0</w:t>
-      </w:r>
-      <w:r>
-        <w:rPr>
-          <w:rFonts w:ascii="Calibri" w:eastAsia="Calibri" w:hAnsi="Calibri" w:cs="Calibri"/>
-          <w:sz w:val="22"/>
-          <w:szCs w:val="22"/>
-          <w:u w:val="single"/>
-        </w:rPr>
-        <w:t>%)</w:t>
+        <w:t>Final Exercise (10%)</w:t>
       </w:r>
     </w:p>
     <w:p>
@@ -3558,23 +2520,7 @@
           <w:sz w:val="22"/>
           <w:szCs w:val="22"/>
         </w:rPr>
-        <w:t xml:space="preserve">Please note that the </w:t>
-      </w:r>
-      <w:r>
-        <w:rPr>
-          <w:rFonts w:ascii="Calibri" w:eastAsia="Calibri" w:hAnsi="Calibri" w:cs="Calibri"/>
-          <w:sz w:val="22"/>
-          <w:szCs w:val="22"/>
-        </w:rPr>
-        <w:t>final</w:t>
-      </w:r>
-      <w:r>
-        <w:rPr>
-          <w:rFonts w:ascii="Calibri" w:eastAsia="Calibri" w:hAnsi="Calibri" w:cs="Calibri"/>
-          <w:sz w:val="22"/>
-          <w:szCs w:val="22"/>
-        </w:rPr>
-        <w:t xml:space="preserve"> exam will be a two-stage exam (see details below).</w:t>
+        <w:t>Please note that the final exam will be a two-stage exam (see details below).</w:t>
       </w:r>
     </w:p>
     <w:p>
@@ -3614,23 +2560,7 @@
           <w:sz w:val="22"/>
           <w:szCs w:val="22"/>
         </w:rPr>
-        <w:t xml:space="preserve"> All students are expected to take the exams on the assigned days. We will adhere to the Registrar’s policy regarding rescheduling of exams (</w:t>
-      </w:r>
-      <w:r>
-        <w:rPr>
-          <w:rFonts w:ascii="Calibri" w:eastAsia="Calibri" w:hAnsi="Calibri" w:cs="Calibri"/>
-          <w:sz w:val="22"/>
-          <w:szCs w:val="22"/>
-        </w:rPr>
-        <w:t>i.e.,</w:t>
-      </w:r>
-      <w:r>
-        <w:rPr>
-          <w:rFonts w:ascii="Calibri" w:eastAsia="Calibri" w:hAnsi="Calibri" w:cs="Calibri"/>
-          <w:sz w:val="22"/>
-          <w:szCs w:val="22"/>
-        </w:rPr>
-        <w:t xml:space="preserve"> only to be done in case of documented health-related or personal emergencies). </w:t>
+        <w:t xml:space="preserve"> All students are expected to take the exams on the assigned days. We will adhere to the Registrar’s policy regarding rescheduling of exams (i.e., only to be done in case of documented health-related or personal emergencies). </w:t>
       </w:r>
     </w:p>
     <w:p>
@@ -3670,25 +2600,7 @@
           <w:sz w:val="22"/>
           <w:szCs w:val="22"/>
         </w:rPr>
-        <w:t xml:space="preserve">: The midterm and final exams will be two-stage exams. During Stage 1, you will be asked to complete the exam individually. After Stage 1, the exams will be </w:t>
-      </w:r>
-      <w:proofErr w:type="gramStart"/>
-      <w:r>
-        <w:rPr>
-          <w:rFonts w:ascii="Calibri" w:eastAsia="Calibri" w:hAnsi="Calibri" w:cs="Calibri"/>
-          <w:sz w:val="22"/>
-          <w:szCs w:val="22"/>
-        </w:rPr>
-        <w:t>collected</w:t>
-      </w:r>
-      <w:proofErr w:type="gramEnd"/>
-      <w:r>
-        <w:rPr>
-          <w:rFonts w:ascii="Calibri" w:eastAsia="Calibri" w:hAnsi="Calibri" w:cs="Calibri"/>
-          <w:sz w:val="22"/>
-          <w:szCs w:val="22"/>
-        </w:rPr>
-        <w:t xml:space="preserve"> and you will be given a second exam that will contain a subset of the questions from the original exam. During Stage 2, you will be asked to work with a group, reach consensus answers, and submit one copy of the exam for the whole group. If your group grade is higher than your individual grade for that subset of questions, your grade for those questions will be 90% of your Stage 1 score plus 10% of your Stage 2 score. If your Stage 2 grade is lower than your Stage 1 grade, we will not incorporate Stage 2 into your score and your exam grade will simply be your Stage 1 grade. </w:t>
+        <w:t xml:space="preserve">: The midterm and final exams will be two-stage exams. During Stage 1, you will be asked to complete the exam individually. After Stage 1, the exams will be collected and you will be given a second exam that will contain a subset of the questions from the original exam. During Stage 2, you will be asked to work with a group, reach consensus answers, and submit one copy of the exam for the whole group. If your group grade is higher than your individual grade for that subset of questions, your grade for those questions will be 90% of your Stage 1 score plus 10% of your Stage 2 score. If your Stage 2 grade is lower than your Stage 1 grade, we will not incorporate Stage 2 into your score and your exam grade will simply be your Stage 1 grade. </w:t>
       </w:r>
     </w:p>
     <w:p>
@@ -3851,23 +2763,7 @@
           <w:sz w:val="22"/>
           <w:szCs w:val="22"/>
         </w:rPr>
-        <w:t>Grades for each exam and for each component of the course (problem sets, final exercise, and class participation and engagement) will be standardized (</w:t>
-      </w:r>
-      <w:r>
-        <w:rPr>
-          <w:rFonts w:ascii="Calibri" w:eastAsia="Calibri" w:hAnsi="Calibri" w:cs="Calibri"/>
-          <w:sz w:val="22"/>
-          <w:szCs w:val="22"/>
-        </w:rPr>
-        <w:t>i.e.,</w:t>
-      </w:r>
-      <w:r>
-        <w:rPr>
-          <w:rFonts w:ascii="Calibri" w:eastAsia="Calibri" w:hAnsi="Calibri" w:cs="Calibri"/>
-          <w:sz w:val="22"/>
-          <w:szCs w:val="22"/>
-        </w:rPr>
-        <w:t xml:space="preserve"> curved) and then an overall score for the course will be calculated for each student. This overall score will be translated into a final course letter grade using the Dean’s </w:t>
+        <w:t xml:space="preserve">Grades for each exam and for each component of the course (problem sets, final exercise, and class participation and engagement) will be standardized (i.e., curved) and then an overall score for the course will be calculated for each student. This overall score will be translated into a final course letter grade using the Dean’s </w:t>
       </w:r>
       <w:hyperlink r:id="rId23">
         <w:r>
@@ -4017,27 +2913,7 @@
           <w:szCs w:val="22"/>
           <w:highlight w:val="white"/>
         </w:rPr>
-        <w:t xml:space="preserve">: Data will be collected in various forms in this course. Some forms of data collection will be obvious to you (such as when responding to a question on a survey) but others might not be (such as someone from our teaching team recording class participation or the Canvas course website system recording activity while you are logged in). Whatever the form of data collection, I pledge to use the data to help improve my teaching and ultimately </w:t>
-      </w:r>
-      <w:proofErr w:type="gramStart"/>
-      <w:r>
-        <w:rPr>
-          <w:rFonts w:ascii="Calibri" w:eastAsia="Calibri" w:hAnsi="Calibri" w:cs="Calibri"/>
-          <w:sz w:val="22"/>
-          <w:szCs w:val="22"/>
-          <w:highlight w:val="white"/>
-        </w:rPr>
-        <w:t>your</w:t>
-      </w:r>
-      <w:proofErr w:type="gramEnd"/>
-      <w:r>
-        <w:rPr>
-          <w:rFonts w:ascii="Calibri" w:eastAsia="Calibri" w:hAnsi="Calibri" w:cs="Calibri"/>
-          <w:sz w:val="22"/>
-          <w:szCs w:val="22"/>
-          <w:highlight w:val="white"/>
-        </w:rPr>
-        <w:t xml:space="preserve"> learning. This includes using your responses to online quizzes to tailor a class better to the backgrounds and learning needs of students in the class, conducting research about the effectiveness of a particular teaching approach, etc. I also pledge to keep your data confidential so that it can only be used for the purposes of improving teaching and learning or to help you and other students connect with future professional opportunities.</w:t>
+        <w:t>: Data will be collected in various forms in this course. Some forms of data collection will be obvious to you (such as when responding to a question on a survey) but others might not be (such as someone from our teaching team recording class participation or the Canvas course website system recording activity while you are logged in). Whatever the form of data collection, I pledge to use the data to help improve my teaching and ultimately your learning. This includes using your responses to online quizzes to tailor a class better to the backgrounds and learning needs of students in the class, conducting research about the effectiveness of a particular teaching approach, etc. I also pledge to keep your data confidential so that it can only be used for the purposes of improving teaching and learning or to help you and other students connect with future professional opportunities.</w:t>
       </w:r>
     </w:p>
     <w:p>
@@ -4126,17 +3002,7 @@
           <w:szCs w:val="22"/>
           <w:shd w:val="clear" w:color="auto" w:fill="FFFFFF"/>
         </w:rPr>
-        <w:t>:</w:t>
-      </w:r>
-      <w:r>
-        <w:rPr>
-          <w:rFonts w:asciiTheme="majorHAnsi" w:hAnsiTheme="majorHAnsi" w:cstheme="majorHAnsi"/>
-          <w:color w:val="222222"/>
-          <w:sz w:val="22"/>
-          <w:szCs w:val="22"/>
-          <w:shd w:val="clear" w:color="auto" w:fill="FFFFFF"/>
-        </w:rPr>
-        <w:t xml:space="preserve"> In this course, we follow HKS non-attribution rule which states "All HKS events are, unless otherwise explicitly stated, not for attribution. This means you can share in a general way what you learned, but not who said what, without expressed permission. We do this to maintain a culture of mutual respect and trust within our community, and to ensure that we can learn from candid discussion about a wide range of perspectives and experiences."</w:t>
+        <w:t>: In this course, we follow HKS non-attribution rule which states "All HKS events are, unless otherwise explicitly stated, not for attribution. This means you can share in a general way what you learned, but not who said what, without expressed permission. We do this to maintain a culture of mutual respect and trust within our community, and to ensure that we can learn from candid discussion about a wide range of perspectives and experiences."</w:t>
       </w:r>
     </w:p>
     <w:p>
@@ -4256,15 +3122,7 @@
           <w:sz w:val="22"/>
           <w:szCs w:val="22"/>
         </w:rPr>
-        <w:t xml:space="preserve"> schedule is below.  Adjustments may need to be made and will be communicated as soon as they are available. W refers to readings from Wooldridge. For a refresher on the concepts indicated in the background section of the schedule (last column of table below), see Deb Hughes Hallett's excellent handouts (click on "Math Camp" link here</w:t>
-      </w:r>
-      <w:r>
-        <w:rPr>
-          <w:rFonts w:ascii="Calibri" w:eastAsia="Calibri" w:hAnsi="Calibri" w:cs="Calibri"/>
-          <w:sz w:val="22"/>
-          <w:szCs w:val="22"/>
-        </w:rPr>
-        <w:t>:</w:t>
+        <w:t xml:space="preserve"> schedule is below.  Adjustments may need to be made and will be communicated as soon as they are available. W refers to readings from Wooldridge. For a refresher on the concepts indicated in the background section of the schedule (last column of table below), see Deb Hughes Hallett's excellent handouts (click on "Math Camp" link here:</w:t>
       </w:r>
       <w:r>
         <w:t xml:space="preserve"> </w:t>
@@ -4286,15 +3144,7 @@
           <w:sz w:val="22"/>
           <w:szCs w:val="22"/>
         </w:rPr>
-        <w:t>)</w:t>
-      </w:r>
-      <w:r>
-        <w:rPr>
-          <w:rFonts w:ascii="Calibri" w:eastAsia="Calibri" w:hAnsi="Calibri" w:cs="Calibri"/>
-          <w:sz w:val="22"/>
-          <w:szCs w:val="22"/>
-        </w:rPr>
-        <w:t>.</w:t>
+        <w:t>).</w:t>
       </w:r>
     </w:p>
     <w:p>
@@ -4440,7 +3290,6 @@
           <w:szCs w:val="22"/>
         </w:rPr>
       </w:pPr>
-      <w:proofErr w:type="spellStart"/>
       <w:r>
         <w:rPr>
           <w:rFonts w:ascii="Calibri" w:eastAsia="Calibri" w:hAnsi="Calibri" w:cs="Calibri"/>
@@ -4448,17 +3297,7 @@
           <w:sz w:val="22"/>
           <w:szCs w:val="22"/>
         </w:rPr>
-        <w:t>Shadish</w:t>
-      </w:r>
-      <w:proofErr w:type="spellEnd"/>
-      <w:r>
-        <w:rPr>
-          <w:rFonts w:ascii="Calibri" w:eastAsia="Calibri" w:hAnsi="Calibri" w:cs="Calibri"/>
-          <w:color w:val="000000"/>
-          <w:sz w:val="22"/>
-          <w:szCs w:val="22"/>
-        </w:rPr>
-        <w:t xml:space="preserve">, William R., Thomas D. Cook, and Donald T. Campbell. 2002.” Statistical Conclusion Validity and Internal Validity,” and “Construct Validity and External Validity.” Chapters 1, 2, and 3 in </w:t>
+        <w:t xml:space="preserve">Shadish, William R., Thomas D. Cook, and Donald T. Campbell. 2002.” Statistical Conclusion Validity and Internal Validity,” and “Construct Validity and External Validity.” Chapters 1, 2, and 3 in </w:t>
       </w:r>
       <w:r>
         <w:rPr>
@@ -4497,18 +3336,8 @@
           <w:sz w:val="22"/>
           <w:szCs w:val="22"/>
         </w:rPr>
-        <w:t xml:space="preserve">Stokey and </w:t>
-      </w:r>
-      <w:proofErr w:type="spellStart"/>
-      <w:r>
-        <w:rPr>
-          <w:rFonts w:ascii="Calibri" w:eastAsia="Calibri" w:hAnsi="Calibri" w:cs="Calibri"/>
-          <w:sz w:val="22"/>
-          <w:szCs w:val="22"/>
-        </w:rPr>
-        <w:t>Zeckhauser</w:t>
-      </w:r>
-      <w:proofErr w:type="spellEnd"/>
+        <w:t>Stokey and Zeckhauser</w:t>
+      </w:r>
       <w:r>
         <w:rPr>
           <w:rFonts w:ascii="Calibri" w:eastAsia="Calibri" w:hAnsi="Calibri" w:cs="Calibri"/>
@@ -5387,27 +4216,7 @@
                 <w:sz w:val="14"/>
                 <w:szCs w:val="14"/>
               </w:rPr>
-              <w:t xml:space="preserve">Stokey and </w:t>
-            </w:r>
-            <w:proofErr w:type="spellStart"/>
-            <w:r>
-              <w:rPr>
-                <w:rFonts w:ascii="Calibri" w:hAnsi="Calibri" w:cs="Calibri"/>
-                <w:color w:val="000000"/>
-                <w:sz w:val="14"/>
-                <w:szCs w:val="14"/>
-              </w:rPr>
-              <w:t>Zeckhauser</w:t>
-            </w:r>
-            <w:proofErr w:type="spellEnd"/>
-            <w:r>
-              <w:rPr>
-                <w:rFonts w:ascii="Calibri" w:hAnsi="Calibri" w:cs="Calibri"/>
-                <w:color w:val="000000"/>
-                <w:sz w:val="14"/>
-                <w:szCs w:val="14"/>
-              </w:rPr>
-              <w:t xml:space="preserve"> (Ch 12), The Economist (2020)</w:t>
+              <w:t>Stokey and Zeckhauser (Ch 12), The Economist (2020)</w:t>
             </w:r>
           </w:p>
         </w:tc>
@@ -6122,25 +4931,7 @@
                 <w:sz w:val="14"/>
                 <w:szCs w:val="14"/>
               </w:rPr>
-              <w:t>•Hypothesis Tests Involving the Normal distribution •Hypothesis tests involving the t distribution</w:t>
-            </w:r>
-            <w:r>
-              <w:rPr>
-                <w:rFonts w:ascii="Calibri" w:hAnsi="Calibri" w:cs="Calibri"/>
-                <w:color w:val="000000"/>
-                <w:sz w:val="14"/>
-                <w:szCs w:val="14"/>
-              </w:rPr>
-              <w:t xml:space="preserve"> </w:t>
-            </w:r>
-            <w:r>
-              <w:rPr>
-                <w:rFonts w:ascii="Calibri" w:hAnsi="Calibri" w:cs="Calibri"/>
-                <w:color w:val="000000"/>
-                <w:sz w:val="14"/>
-                <w:szCs w:val="14"/>
-              </w:rPr>
-              <w:t>•Hypothesis tests in the context of regression analysis</w:t>
+              <w:t>•Hypothesis Tests Involving the Normal distribution •Hypothesis tests involving the t distribution •Hypothesis tests in the context of regression analysis</w:t>
             </w:r>
           </w:p>
         </w:tc>
@@ -6341,7 +5132,6 @@
                 <w:szCs w:val="14"/>
               </w:rPr>
             </w:pPr>
-            <w:proofErr w:type="gramStart"/>
             <w:r>
               <w:rPr>
                 <w:rFonts w:ascii="Calibri" w:hAnsi="Calibri" w:cs="Calibri"/>
@@ -6349,17 +5139,7 @@
                 <w:sz w:val="14"/>
                 <w:szCs w:val="14"/>
               </w:rPr>
-              <w:t>W[</w:t>
-            </w:r>
-            <w:proofErr w:type="gramEnd"/>
-            <w:r>
-              <w:rPr>
-                <w:rFonts w:ascii="Calibri" w:hAnsi="Calibri" w:cs="Calibri"/>
-                <w:color w:val="000000"/>
-                <w:sz w:val="14"/>
-                <w:szCs w:val="14"/>
-              </w:rPr>
-              <w:t>Appendix: B.5]</w:t>
+              <w:t>W[Appendix: B.5]</w:t>
             </w:r>
           </w:p>
         </w:tc>
@@ -6847,21 +5627,7 @@
                 <w:rFonts w:ascii="Calibri" w:hAnsi="Calibri" w:cs="Calibri"/>
                 <w:color w:val="000000"/>
               </w:rPr>
-              <w:t>1</w:t>
-            </w:r>
-            <w:r>
-              <w:rPr>
-                <w:rFonts w:ascii="Calibri" w:hAnsi="Calibri" w:cs="Calibri"/>
-                <w:color w:val="000000"/>
-              </w:rPr>
-              <w:t>0</w:t>
-            </w:r>
-            <w:r>
-              <w:rPr>
-                <w:rFonts w:ascii="Calibri" w:hAnsi="Calibri" w:cs="Calibri"/>
-                <w:color w:val="000000"/>
-              </w:rPr>
-              <w:t>-Oct</w:t>
+              <w:t>10-Oct</w:t>
             </w:r>
           </w:p>
         </w:tc>
@@ -7901,30 +6667,7 @@
                 <w:rFonts w:ascii="Calibri" w:hAnsi="Calibri" w:cs="Calibri"/>
                 <w:color w:val="000000"/>
               </w:rPr>
-              <w:t xml:space="preserve">REGRESSION: Multiple Regression Analysis </w:t>
-            </w:r>
-            <w:proofErr w:type="gramStart"/>
-            <w:r>
-              <w:rPr>
-                <w:rFonts w:ascii="Calibri" w:hAnsi="Calibri" w:cs="Calibri"/>
-                <w:color w:val="000000"/>
-              </w:rPr>
-              <w:t>-  Inference</w:t>
-            </w:r>
-            <w:proofErr w:type="gramEnd"/>
-            <w:r>
-              <w:rPr>
-                <w:rFonts w:ascii="Calibri" w:hAnsi="Calibri" w:cs="Calibri"/>
-                <w:color w:val="000000"/>
-              </w:rPr>
-              <w:t xml:space="preserve"> and </w:t>
-            </w:r>
-            <w:r>
-              <w:rPr>
-                <w:rFonts w:ascii="Calibri" w:hAnsi="Calibri" w:cs="Calibri"/>
-                <w:color w:val="000000"/>
-              </w:rPr>
-              <w:t>Non-Linear Functional Forms</w:t>
+              <w:t>REGRESSION: Multiple Regression Analysis -  Inference and Non-Linear Functional Forms</w:t>
             </w:r>
           </w:p>
         </w:tc>
@@ -7950,16 +6693,7 @@
                 <w:sz w:val="14"/>
                 <w:szCs w:val="14"/>
               </w:rPr>
-              <w:t xml:space="preserve">• Sampling Distribution of OLS Estimators • Testing hypotheses about a single population parameter: The t test • Testing multiple linear restrictions: The F test </w:t>
-            </w:r>
-            <w:r>
-              <w:rPr>
-                <w:rFonts w:ascii="Calibri" w:hAnsi="Calibri" w:cs="Calibri"/>
-                <w:color w:val="000000"/>
-                <w:sz w:val="14"/>
-                <w:szCs w:val="14"/>
-              </w:rPr>
-              <w:t>• Logs</w:t>
+              <w:t>• Sampling Distribution of OLS Estimators • Testing hypotheses about a single population parameter: The t test • Testing multiple linear restrictions: The F test • Logs</w:t>
             </w:r>
           </w:p>
         </w:tc>
@@ -8280,34 +7014,7 @@
                 <w:bCs/>
                 <w:color w:val="000000"/>
               </w:rPr>
-              <w:t xml:space="preserve">NO CLASS </w:t>
-            </w:r>
-            <w:r>
-              <w:rPr>
-                <w:rFonts w:ascii="Calibri" w:hAnsi="Calibri" w:cs="Calibri"/>
-                <w:b/>
-                <w:bCs/>
-                <w:color w:val="000000"/>
-              </w:rPr>
-              <w:t>–</w:t>
-            </w:r>
-            <w:r>
-              <w:rPr>
-                <w:rFonts w:ascii="Calibri" w:hAnsi="Calibri" w:cs="Calibri"/>
-                <w:b/>
-                <w:bCs/>
-                <w:color w:val="000000"/>
-              </w:rPr>
-              <w:t xml:space="preserve"> </w:t>
-            </w:r>
-            <w:r>
-              <w:rPr>
-                <w:rFonts w:ascii="Calibri" w:hAnsi="Calibri" w:cs="Calibri"/>
-                <w:b/>
-                <w:bCs/>
-                <w:color w:val="000000"/>
-              </w:rPr>
-              <w:t>Veteran’s Day</w:t>
+              <w:t>NO CLASS – Veteran’s Day</w:t>
             </w:r>
           </w:p>
         </w:tc>
@@ -8396,14 +7103,7 @@
                 <w:rFonts w:ascii="Calibri" w:hAnsi="Calibri" w:cs="Calibri"/>
                 <w:color w:val="000000"/>
               </w:rPr>
-              <w:t>2</w:t>
-            </w:r>
-            <w:r>
-              <w:rPr>
-                <w:rFonts w:ascii="Calibri" w:hAnsi="Calibri" w:cs="Calibri"/>
-                <w:color w:val="000000"/>
-              </w:rPr>
-              <w:t>1</w:t>
+              <w:t>21</w:t>
             </w:r>
           </w:p>
         </w:tc>
@@ -8425,14 +7125,7 @@
                 <w:rFonts w:ascii="Calibri" w:hAnsi="Calibri" w:cs="Calibri"/>
                 <w:color w:val="000000"/>
               </w:rPr>
-              <w:t>MACHINE LEARNING</w:t>
-            </w:r>
-            <w:r>
-              <w:rPr>
-                <w:rFonts w:ascii="Calibri" w:hAnsi="Calibri" w:cs="Calibri"/>
-                <w:color w:val="000000"/>
-              </w:rPr>
-              <w:t>: The Basics of Prediction for Binary Variables</w:t>
+              <w:t>MACHINE LEARNING: The Basics of Prediction for Binary Variables</w:t>
             </w:r>
           </w:p>
         </w:tc>
@@ -8552,14 +7245,7 @@
                 <w:rFonts w:ascii="Calibri" w:hAnsi="Calibri" w:cs="Calibri"/>
                 <w:color w:val="000000"/>
               </w:rPr>
-              <w:t>2</w:t>
-            </w:r>
-            <w:r>
-              <w:rPr>
-                <w:rFonts w:ascii="Calibri" w:hAnsi="Calibri" w:cs="Calibri"/>
-                <w:color w:val="000000"/>
-              </w:rPr>
-              <w:t>2</w:t>
+              <w:t>22</w:t>
             </w:r>
           </w:p>
         </w:tc>
@@ -8581,14 +7267,7 @@
                 <w:rFonts w:ascii="Calibri" w:hAnsi="Calibri" w:cs="Calibri"/>
                 <w:color w:val="000000"/>
               </w:rPr>
-              <w:t>MACHINE LEARNING</w:t>
-            </w:r>
-            <w:r>
-              <w:rPr>
-                <w:rFonts w:ascii="Calibri" w:hAnsi="Calibri" w:cs="Calibri"/>
-                <w:color w:val="000000"/>
-              </w:rPr>
-              <w:t>: Prediction III - The OSHA Case</w:t>
+              <w:t>MACHINE LEARNING: Prediction III - The OSHA Case</w:t>
             </w:r>
           </w:p>
         </w:tc>
@@ -8722,14 +7401,7 @@
                 <w:rFonts w:ascii="Calibri" w:hAnsi="Calibri" w:cs="Calibri"/>
                 <w:color w:val="000000"/>
               </w:rPr>
-              <w:t>2</w:t>
-            </w:r>
-            <w:r>
-              <w:rPr>
-                <w:rFonts w:ascii="Calibri" w:hAnsi="Calibri" w:cs="Calibri"/>
-                <w:color w:val="000000"/>
-              </w:rPr>
-              <w:t>3</w:t>
+              <w:t>23</w:t>
             </w:r>
           </w:p>
         </w:tc>
@@ -8821,7 +7493,6 @@
                 <w:szCs w:val="14"/>
               </w:rPr>
             </w:pPr>
-            <w:proofErr w:type="spellStart"/>
             <w:r>
               <w:rPr>
                 <w:rFonts w:ascii="Calibri" w:hAnsi="Calibri" w:cs="Calibri"/>
@@ -8829,17 +7500,7 @@
                 <w:sz w:val="14"/>
                 <w:szCs w:val="14"/>
               </w:rPr>
-              <w:t>Shadish</w:t>
-            </w:r>
-            <w:proofErr w:type="spellEnd"/>
-            <w:r>
-              <w:rPr>
-                <w:rFonts w:ascii="Calibri" w:hAnsi="Calibri" w:cs="Calibri"/>
-                <w:color w:val="000000"/>
-                <w:sz w:val="14"/>
-                <w:szCs w:val="14"/>
-              </w:rPr>
-              <w:t xml:space="preserve"> et al. (2004)</w:t>
+              <w:t>Shadish et al. (2004)</w:t>
             </w:r>
           </w:p>
         </w:tc>
@@ -8892,14 +7553,7 @@
                 <w:rFonts w:ascii="Calibri" w:hAnsi="Calibri" w:cs="Calibri"/>
                 <w:color w:val="000000"/>
               </w:rPr>
-              <w:t>2</w:t>
-            </w:r>
-            <w:r>
-              <w:rPr>
-                <w:rFonts w:ascii="Calibri" w:hAnsi="Calibri" w:cs="Calibri"/>
-                <w:color w:val="000000"/>
-              </w:rPr>
-              <w:t>4</w:t>
+              <w:t>24</w:t>
             </w:r>
           </w:p>
         </w:tc>
@@ -8921,17 +7575,8 @@
                 <w:rFonts w:ascii="Calibri" w:hAnsi="Calibri" w:cs="Calibri"/>
                 <w:color w:val="000000"/>
               </w:rPr>
-              <w:t xml:space="preserve">OVERALL: Assessing the Effects of an Intervention - The Case of </w:t>
-            </w:r>
-            <w:proofErr w:type="spellStart"/>
-            <w:r>
-              <w:rPr>
-                <w:rFonts w:ascii="Calibri" w:hAnsi="Calibri" w:cs="Calibri"/>
-                <w:color w:val="000000"/>
-              </w:rPr>
-              <w:t>IDinsight</w:t>
-            </w:r>
-            <w:proofErr w:type="spellEnd"/>
+              <w:t>OVERALL: Assessing the Effects of an Intervention - The Case of IDinsight</w:t>
+            </w:r>
           </w:p>
         </w:tc>
         <w:tc>
@@ -9011,19 +7656,8 @@
                 <w:sz w:val="14"/>
                 <w:szCs w:val="14"/>
               </w:rPr>
-              <w:t xml:space="preserve">Case Study about </w:t>
-            </w:r>
-            <w:proofErr w:type="spellStart"/>
-            <w:r>
-              <w:rPr>
-                <w:rFonts w:ascii="Calibri" w:hAnsi="Calibri" w:cs="Calibri"/>
-                <w:color w:val="000000"/>
-                <w:sz w:val="14"/>
-                <w:szCs w:val="14"/>
-              </w:rPr>
-              <w:t>IDinsight</w:t>
-            </w:r>
-            <w:proofErr w:type="spellEnd"/>
+              <w:t>Case Study about IDinsight</w:t>
+            </w:r>
           </w:p>
         </w:tc>
       </w:tr>
@@ -9185,14 +7819,7 @@
                 <w:rFonts w:ascii="Calibri" w:hAnsi="Calibri" w:cs="Calibri"/>
                 <w:color w:val="000000"/>
               </w:rPr>
-              <w:t>2</w:t>
-            </w:r>
-            <w:r>
-              <w:rPr>
-                <w:rFonts w:ascii="Calibri" w:hAnsi="Calibri" w:cs="Calibri"/>
-                <w:color w:val="000000"/>
-              </w:rPr>
-              <w:t>5</w:t>
+              <w:t>25</w:t>
             </w:r>
           </w:p>
         </w:tc>
@@ -9333,14 +7960,7 @@
                 <w:rFonts w:ascii="Calibri" w:hAnsi="Calibri" w:cs="Calibri"/>
                 <w:color w:val="000000"/>
               </w:rPr>
-              <w:t>2</w:t>
-            </w:r>
-            <w:r>
-              <w:rPr>
-                <w:rFonts w:ascii="Calibri" w:hAnsi="Calibri" w:cs="Calibri"/>
-                <w:color w:val="000000"/>
-              </w:rPr>
-              <w:t>6</w:t>
+              <w:t>26</w:t>
             </w:r>
           </w:p>
         </w:tc>
@@ -9503,16 +8123,7 @@
                 <w:bCs/>
                 <w:color w:val="000000"/>
               </w:rPr>
-              <w:t xml:space="preserve">FINAL EXAM </w:t>
-            </w:r>
-            <w:r>
-              <w:rPr>
-                <w:rFonts w:ascii="Calibri" w:hAnsi="Calibri" w:cs="Calibri"/>
-                <w:b/>
-                <w:bCs/>
-                <w:color w:val="000000"/>
-              </w:rPr>
-              <w:t>(9 AM – 12 PM)</w:t>
+              <w:t>FINAL EXAM (9 AM – 12 PM)</w:t>
             </w:r>
           </w:p>
         </w:tc>

</xml_diff>